<commit_message>
Fill MC GROUP LLC details into ownership chain description
Co-Authored-By: Claude Opus 5.5 <noreply@anthropic.com>
Claude-Session: https://claude.ai/code/session_013tCH7y2U4FTDBfDwDzDjyt
</commit_message>
<xml_diff>
--- a/docs/Описание_цепочки_косвенного_участия_ООО_ИДТ.docx
+++ b/docs/Описание_цепочки_косвенного_участия_ООО_ИДТ.docx
@@ -77,7 +77,20 @@
           <w:sz w:val="22"/>
           <w:szCs w:val="22"/>
         </w:rPr>
-        <w:t xml:space="preserve">Единственным (100%) участником ООО «МЕНЕДЖМЕНТ КАПИТАЛ» является ООО «ЭМ СИ ГРУП» (Республика Армения; регистрационный номер </w:t>
+        <w:t xml:space="preserve">Единственным (100%) участником ООО «МЕНЕДЖМЕНТ КАПИТАЛ» является ООО «Эм Си Груп» (MC GROUP LLC) (Республика Армения; дата регистрации 05.05.2025, идентификационный номер в Государственном регистре юридических лиц 55422822, ИНН (ՀՎՀՀ) 08298824, юридический адрес: Республика Армения, г. Ереван, район Арабкир, ул. А. Хачатряна, д. 21, кв. 27) – доля 100% (номинальная стоимость 502 449 191 руб.).</w:t>
+      </w:r>
+    </w:p>
+    <w:p>
+      <w:pPr>
+        <w:spacing w:after="200" w:line="288"/>
+      </w:pPr>
+      <w:r>
+        <w:rPr>
+          <w:rFonts w:ascii="Arial" w:cs="Arial" w:eastAsia="Arial" w:hAnsi="Arial"/>
+          <w:sz w:val="22"/>
+          <w:szCs w:val="22"/>
+        </w:rPr>
+        <w:t xml:space="preserve">Единственным (100%) участником ООО «Эм Си Груп» (Армения) является физическое лицо – Геворкян Степан Арамович; руководителем исполнительного органа данной компании является </w:t>
       </w:r>
       <w:r>
         <w:rPr>
@@ -87,51 +100,15 @@
           <w:highlight w:val="yellow"/>
           <w:highlightCs w:val="yellow"/>
         </w:rPr>
-        <w:t xml:space="preserve">[___]</w:t>
-      </w:r>
-      <w:r>
-        <w:rPr>
-          <w:rFonts w:ascii="Arial" w:cs="Arial" w:eastAsia="Arial" w:hAnsi="Arial"/>
-          <w:sz w:val="22"/>
-          <w:szCs w:val="22"/>
-        </w:rPr>
-        <w:t xml:space="preserve">, ИНН (ՀՎՀՀ) </w:t>
-      </w:r>
-      <w:r>
-        <w:rPr>
-          <w:rFonts w:ascii="Arial" w:cs="Arial" w:eastAsia="Arial" w:hAnsi="Arial"/>
-          <w:sz w:val="22"/>
-          <w:szCs w:val="22"/>
-          <w:highlight w:val="yellow"/>
-          <w:highlightCs w:val="yellow"/>
-        </w:rPr>
-        <w:t xml:space="preserve">[___]</w:t>
-      </w:r>
-      <w:r>
-        <w:rPr>
-          <w:rFonts w:ascii="Arial" w:cs="Arial" w:eastAsia="Arial" w:hAnsi="Arial"/>
-          <w:sz w:val="22"/>
-          <w:szCs w:val="22"/>
-        </w:rPr>
-        <w:t xml:space="preserve">, юридический адрес: </w:t>
-      </w:r>
-      <w:r>
-        <w:rPr>
-          <w:rFonts w:ascii="Arial" w:cs="Arial" w:eastAsia="Arial" w:hAnsi="Arial"/>
-          <w:sz w:val="22"/>
-          <w:szCs w:val="22"/>
-          <w:highlight w:val="yellow"/>
-          <w:highlightCs w:val="yellow"/>
-        </w:rPr>
-        <w:t xml:space="preserve">[Республика Армения, ___]</w:t>
-      </w:r>
-      <w:r>
-        <w:rPr>
-          <w:rFonts w:ascii="Arial" w:cs="Arial" w:eastAsia="Arial" w:hAnsi="Arial"/>
-          <w:sz w:val="22"/>
-          <w:szCs w:val="22"/>
-        </w:rPr>
-        <w:t xml:space="preserve">) – доля 100% (номинальная стоимость 502 449 191 руб.).</w:t>
+        <w:t xml:space="preserve">[ФИО]</w:t>
+      </w:r>
+      <w:r>
+        <w:rPr>
+          <w:rFonts w:ascii="Arial" w:cs="Arial" w:eastAsia="Arial" w:hAnsi="Arial"/>
+          <w:sz w:val="22"/>
+          <w:szCs w:val="22"/>
+        </w:rPr>
+        <w:t xml:space="preserve">. Геворкян С.А. также является генеральным директором ООО «МЕНЕДЖМЕНТ КАПИТАЛ» (с 5 ноября 2025 года).</w:t>
       </w:r>
     </w:p>
     <w:p>
@@ -144,128 +121,7 @@
           <w:sz w:val="22"/>
           <w:szCs w:val="22"/>
         </w:rPr>
-        <w:t xml:space="preserve">Участником ООО «ЭМ СИ ГРУП» (Армения) является </w:t>
-      </w:r>
-      <w:r>
-        <w:rPr>
-          <w:rFonts w:ascii="Arial" w:cs="Arial" w:eastAsia="Arial" w:hAnsi="Arial"/>
-          <w:sz w:val="22"/>
-          <w:szCs w:val="22"/>
-          <w:highlight w:val="yellow"/>
-          <w:highlightCs w:val="yellow"/>
-        </w:rPr>
-        <w:t xml:space="preserve">[ФИО]</w:t>
-      </w:r>
-      <w:r>
-        <w:rPr>
-          <w:rFonts w:ascii="Arial" w:cs="Arial" w:eastAsia="Arial" w:hAnsi="Arial"/>
-          <w:sz w:val="22"/>
-          <w:szCs w:val="22"/>
-        </w:rPr>
-        <w:t xml:space="preserve"> (</w:t>
-      </w:r>
-      <w:r>
-        <w:rPr>
-          <w:rFonts w:ascii="Arial" w:cs="Arial" w:eastAsia="Arial" w:hAnsi="Arial"/>
-          <w:sz w:val="22"/>
-          <w:szCs w:val="22"/>
-          <w:highlight w:val="yellow"/>
-          <w:highlightCs w:val="yellow"/>
-        </w:rPr>
-        <w:t xml:space="preserve">[гражданство]</w:t>
-      </w:r>
-      <w:r>
-        <w:rPr>
-          <w:rFonts w:ascii="Arial" w:cs="Arial" w:eastAsia="Arial" w:hAnsi="Arial"/>
-          <w:sz w:val="22"/>
-          <w:szCs w:val="22"/>
-        </w:rPr>
-        <w:t xml:space="preserve">) – доля </w:t>
-      </w:r>
-      <w:r>
-        <w:rPr>
-          <w:rFonts w:ascii="Arial" w:cs="Arial" w:eastAsia="Arial" w:hAnsi="Arial"/>
-          <w:sz w:val="22"/>
-          <w:szCs w:val="22"/>
-          <w:highlight w:val="yellow"/>
-          <w:highlightCs w:val="yellow"/>
-        </w:rPr>
-        <w:t xml:space="preserve">[___]</w:t>
-      </w:r>
-      <w:r>
-        <w:rPr>
-          <w:rFonts w:ascii="Arial" w:cs="Arial" w:eastAsia="Arial" w:hAnsi="Arial"/>
-          <w:sz w:val="22"/>
-          <w:szCs w:val="22"/>
-        </w:rPr>
-        <w:t xml:space="preserve">%; руководителем исполнительного органа данной компании является </w:t>
-      </w:r>
-      <w:r>
-        <w:rPr>
-          <w:rFonts w:ascii="Arial" w:cs="Arial" w:eastAsia="Arial" w:hAnsi="Arial"/>
-          <w:sz w:val="22"/>
-          <w:szCs w:val="22"/>
-          <w:highlight w:val="yellow"/>
-          <w:highlightCs w:val="yellow"/>
-        </w:rPr>
-        <w:t xml:space="preserve">[ФИО]</w:t>
-      </w:r>
-      <w:r>
-        <w:rPr>
-          <w:rFonts w:ascii="Arial" w:cs="Arial" w:eastAsia="Arial" w:hAnsi="Arial"/>
-          <w:sz w:val="22"/>
-          <w:szCs w:val="22"/>
-        </w:rPr>
-        <w:t xml:space="preserve">.</w:t>
-      </w:r>
-    </w:p>
-    <w:p>
-      <w:pPr>
-        <w:spacing w:after="200" w:line="288"/>
-      </w:pPr>
-      <w:r>
-        <w:rPr>
-          <w:rFonts w:ascii="Arial" w:cs="Arial" w:eastAsia="Arial" w:hAnsi="Arial"/>
-          <w:sz w:val="22"/>
-          <w:szCs w:val="22"/>
-        </w:rPr>
-        <w:t xml:space="preserve">Таким образом, </w:t>
-      </w:r>
-      <w:r>
-        <w:rPr>
-          <w:rFonts w:ascii="Arial" w:cs="Arial" w:eastAsia="Arial" w:hAnsi="Arial"/>
-          <w:sz w:val="22"/>
-          <w:szCs w:val="22"/>
-          <w:highlight w:val="yellow"/>
-          <w:highlightCs w:val="yellow"/>
-        </w:rPr>
-        <w:t xml:space="preserve">[ФИО]</w:t>
-      </w:r>
-      <w:r>
-        <w:rPr>
-          <w:rFonts w:ascii="Arial" w:cs="Arial" w:eastAsia="Arial" w:hAnsi="Arial"/>
-          <w:sz w:val="22"/>
-          <w:szCs w:val="22"/>
-        </w:rPr>
-        <w:t xml:space="preserve"> контролирует </w:t>
-      </w:r>
-      <w:r>
-        <w:rPr>
-          <w:rFonts w:ascii="Arial" w:cs="Arial" w:eastAsia="Arial" w:hAnsi="Arial"/>
-          <w:sz w:val="22"/>
-          <w:szCs w:val="22"/>
-          <w:highlight w:val="yellow"/>
-          <w:highlightCs w:val="yellow"/>
-        </w:rPr>
-        <w:t xml:space="preserve">[___]</w:t>
-      </w:r>
-      <w:r>
-        <w:rPr>
-          <w:rFonts w:ascii="Arial" w:cs="Arial" w:eastAsia="Arial" w:hAnsi="Arial"/>
-          <w:sz w:val="22"/>
-          <w:szCs w:val="22"/>
-        </w:rPr>
-        <w:t xml:space="preserve">% уставного капитала ООО «ИДТ» косвенно – через ООО «ЭМ СИ ГРУП» (Республика Армения), которому на 100% принадлежит ООО «МЕНЕДЖМЕНТ КАПИТАЛ», являющееся единственным участником ООО «ИДТ».</w:t>
+        <w:t xml:space="preserve">Таким образом, Геворкян Степан Арамович контролирует 100% уставного капитала ООО «ИДТ» косвенно – через принадлежащее ему на 100% ООО «Эм Си Груп» (Республика Армения), которому, в свою очередь, на 100% принадлежит ООО «МЕНЕДЖМЕНТ КАПИТАЛ», являющееся единственным участником ООО «ИДТ».</w:t>
       </w:r>
     </w:p>
     <w:p>
@@ -296,7 +152,7 @@
           <w:sz w:val="22"/>
           <w:szCs w:val="22"/>
         </w:rPr>
-        <w:t xml:space="preserve">промежуточные звенья цепочки: ООО «МЕНЕДЖМЕНТ КАПИТАЛ» – юридическое лицо Российской Федерации; ООО «ЭМ СИ ГРУП» – юридическое лицо Республики Армения;</w:t>
+        <w:t xml:space="preserve">промежуточные звенья цепочки: ООО «МЕНЕДЖМЕНТ КАПИТАЛ» – юридическое лицо Российской Федерации; ООО «Эм Си Груп» – юридическое лицо Республики Армения;</w:t>
       </w:r>
     </w:p>
     <w:p>
@@ -314,7 +170,7 @@
           <w:sz w:val="22"/>
           <w:szCs w:val="22"/>
         </w:rPr>
-        <w:t xml:space="preserve">конечным владельцем и контролирующим лицом всей цепочки является физическое лицо – </w:t>
+        <w:t xml:space="preserve">конечным владельцем и контролирующим лицом всей цепочки является физическое лицо – Геворкян Степан Арамович, гражданин </w:t>
       </w:r>
       <w:r>
         <w:rPr>
@@ -324,15 +180,15 @@
           <w:highlight w:val="yellow"/>
           <w:highlightCs w:val="yellow"/>
         </w:rPr>
-        <w:t xml:space="preserve">[ФИО]</w:t>
-      </w:r>
-      <w:r>
-        <w:rPr>
-          <w:rFonts w:ascii="Arial" w:cs="Arial" w:eastAsia="Arial" w:hAnsi="Arial"/>
-          <w:sz w:val="22"/>
-          <w:szCs w:val="22"/>
-        </w:rPr>
-        <w:t xml:space="preserve">, гражданин </w:t>
+        <w:t xml:space="preserve">[___]</w:t>
+      </w:r>
+      <w:r>
+        <w:rPr>
+          <w:rFonts w:ascii="Arial" w:cs="Arial" w:eastAsia="Arial" w:hAnsi="Arial"/>
+          <w:sz w:val="22"/>
+          <w:szCs w:val="22"/>
+        </w:rPr>
+        <w:t xml:space="preserve"> (паспорт </w:t>
       </w:r>
       <w:r>
         <w:rPr>
@@ -342,15 +198,33 @@
           <w:highlight w:val="yellow"/>
           <w:highlightCs w:val="yellow"/>
         </w:rPr>
-        <w:t xml:space="preserve">[___]</w:t>
-      </w:r>
-      <w:r>
-        <w:rPr>
-          <w:rFonts w:ascii="Arial" w:cs="Arial" w:eastAsia="Arial" w:hAnsi="Arial"/>
-          <w:sz w:val="22"/>
-          <w:szCs w:val="22"/>
-        </w:rPr>
-        <w:t xml:space="preserve"> (паспорт </w:t>
+        <w:t xml:space="preserve">[серия, номер, кем и когда выдан, код подразделения]</w:t>
+      </w:r>
+      <w:r>
+        <w:rPr>
+          <w:rFonts w:ascii="Arial" w:cs="Arial" w:eastAsia="Arial" w:hAnsi="Arial"/>
+          <w:sz w:val="22"/>
+          <w:szCs w:val="22"/>
+        </w:rPr>
+        <w:t xml:space="preserve">; ИНН 770707179846).</w:t>
+      </w:r>
+    </w:p>
+    <w:p>
+      <w:pPr>
+        <w:spacing w:after="120"/>
+      </w:pPr>
+    </w:p>
+    <w:p>
+      <w:pPr>
+        <w:spacing w:after="200" w:line="288"/>
+      </w:pPr>
+      <w:r>
+        <w:rPr>
+          <w:rFonts w:ascii="Arial" w:cs="Arial" w:eastAsia="Arial" w:hAnsi="Arial"/>
+          <w:sz w:val="22"/>
+          <w:szCs w:val="22"/>
+        </w:rPr>
+        <w:t xml:space="preserve">В выписке из Государственного регистра юридических лиц Республики Армения участник ООО «Эм Си Груп» указан как «Степан Геворкян» (</w:t>
       </w:r>
       <w:r>
         <w:rPr>
@@ -360,33 +234,15 @@
           <w:highlight w:val="yellow"/>
           <w:highlightCs w:val="yellow"/>
         </w:rPr>
-        <w:t xml:space="preserve">[серия, номер, кем и когда выдан, код подразделения]</w:t>
-      </w:r>
-      <w:r>
-        <w:rPr>
-          <w:rFonts w:ascii="Arial" w:cs="Arial" w:eastAsia="Arial" w:hAnsi="Arial"/>
-          <w:sz w:val="22"/>
-          <w:szCs w:val="22"/>
-        </w:rPr>
-        <w:t xml:space="preserve">; ИНН </w:t>
-      </w:r>
-      <w:r>
-        <w:rPr>
-          <w:rFonts w:ascii="Arial" w:cs="Arial" w:eastAsia="Arial" w:hAnsi="Arial"/>
-          <w:sz w:val="22"/>
-          <w:szCs w:val="22"/>
-          <w:highlight w:val="yellow"/>
-          <w:highlightCs w:val="yellow"/>
-        </w:rPr>
-        <w:t xml:space="preserve">[___]</w:t>
-      </w:r>
-      <w:r>
-        <w:rPr>
-          <w:rFonts w:ascii="Arial" w:cs="Arial" w:eastAsia="Arial" w:hAnsi="Arial"/>
-          <w:sz w:val="22"/>
-          <w:szCs w:val="22"/>
-        </w:rPr>
-        <w:t xml:space="preserve">).</w:t>
+        <w:t xml:space="preserve">[документ, удостоверяющий личность, указанный в выписке]</w:t>
+      </w:r>
+      <w:r>
+        <w:rPr>
+          <w:rFonts w:ascii="Arial" w:cs="Arial" w:eastAsia="Arial" w:hAnsi="Arial"/>
+          <w:sz w:val="22"/>
+          <w:szCs w:val="22"/>
+        </w:rPr>
+        <w:t xml:space="preserve">). Указанный в армянской выписке участник и генеральный директор ООО «МЕНЕДЖМЕНТ КАПИТАЛ» Геворкян Степан Арамович (ИНН 770707179846) – одно и то же физическое лицо.</w:t>
       </w:r>
     </w:p>
     <w:p>

</xml_diff>

<commit_message>
Update ownership chain description with edited text and conclusion
Co-Authored-By: Claude Opus 5.5 <noreply@anthropic.com>
Claude-Session: https://claude.ai/code/session_013tCH7y2U4FTDBfDwDzDjyt
</commit_message>
<xml_diff>
--- a/docs/Описание_цепочки_косвенного_участия_ООО_ИДТ.docx
+++ b/docs/Описание_цепочки_косвенного_участия_ООО_ИДТ.docx
@@ -33,6 +33,58 @@
     </w:p>
     <w:p>
       <w:pPr>
+        <w:spacing w:after="200" w:line="288"/>
+      </w:pPr>
+      <w:r>
+        <w:rPr>
+          <w:rFonts w:ascii="Arial" w:cs="Arial" w:eastAsia="Arial" w:hAnsi="Arial"/>
+          <w:sz w:val="22"/>
+          <w:szCs w:val="22"/>
+        </w:rPr>
+        <w:t xml:space="preserve">Единственным участником ООО «ИДТ» является ООО «МЕНЕДЖМЕНТ КАПИТАЛ» (Российская Федерация, ИНН 7727319096) – доля 100% (номинальная стоимость 10 000 руб.).</w:t>
+      </w:r>
+    </w:p>
+    <w:p>
+      <w:pPr>
+        <w:spacing w:after="200" w:line="288"/>
+      </w:pPr>
+      <w:r>
+        <w:rPr>
+          <w:rFonts w:ascii="Arial" w:cs="Arial" w:eastAsia="Arial" w:hAnsi="Arial"/>
+          <w:sz w:val="22"/>
+          <w:szCs w:val="22"/>
+        </w:rPr>
+        <w:t xml:space="preserve">Единственным участником ООО «МЕНЕДЖМЕНТ КАПИТАЛ» является ООО «Эм Си Груп» (MC GROUP LLC) (Республика Армения, ИНН 08298824) – доля 100% (номинальная стоимость 502 449 191 руб.).</w:t>
+      </w:r>
+    </w:p>
+    <w:p>
+      <w:pPr>
+        <w:spacing w:after="200" w:line="288"/>
+      </w:pPr>
+      <w:r>
+        <w:rPr>
+          <w:rFonts w:ascii="Arial" w:cs="Arial" w:eastAsia="Arial" w:hAnsi="Arial"/>
+          <w:sz w:val="22"/>
+          <w:szCs w:val="22"/>
+        </w:rPr>
+        <w:t xml:space="preserve">Единственным (100%) участником ООО «Эм Си Груп» (Армения) является физическое лицо – Геворкян Степан Арамович. Геворкян С.А. также является генеральным директором ООО «МЕНЕДЖМЕНТ КАПИТАЛ» (с 5 ноября 2025 года).</w:t>
+      </w:r>
+    </w:p>
+    <w:p>
+      <w:pPr>
+        <w:spacing w:after="200" w:line="288"/>
+      </w:pPr>
+      <w:r>
+        <w:rPr>
+          <w:rFonts w:ascii="Arial" w:cs="Arial" w:eastAsia="Arial" w:hAnsi="Arial"/>
+          <w:sz w:val="22"/>
+          <w:szCs w:val="22"/>
+        </w:rPr>
+        <w:t xml:space="preserve">Таким образом, Геворкян Степан Арамович контролирует 100% уставного капитала ООО «ИДТ» косвенно – через принадлежащее ему на 100% ООО «Эм Си Груп» (Республика Армения), которому, в свою очередь, на 100% принадлежит ООО «МЕНЕДЖМЕНТ КАПИТАЛ», являющееся единственным участником ООО «ИДТ».</w:t>
+      </w:r>
+    </w:p>
+    <w:p>
+      <w:pPr>
         <w:spacing w:after="80" w:line="288"/>
       </w:pPr>
       <w:r>
@@ -41,7 +93,7 @@
           <w:sz w:val="22"/>
           <w:szCs w:val="22"/>
         </w:rPr>
-        <w:t xml:space="preserve">Единственным (100%) участником ООО «ИДТ» является:</w:t>
+        <w:t xml:space="preserve">Гражданство (страновая принадлежность) владельцев:</w:t>
       </w:r>
     </w:p>
     <w:p>
@@ -59,82 +111,7 @@
           <w:sz w:val="22"/>
           <w:szCs w:val="22"/>
         </w:rPr>
-        <w:t xml:space="preserve">ООО «МЕНЕДЖМЕНТ КАПИТАЛ» (Российская Федерация; ИНН 7727319096; генеральный директор – Геворкян Степан Арамович, ИНН 770707179846) – доля 100% (номинальная стоимость 10 000 руб.).</w:t>
-      </w:r>
-    </w:p>
-    <w:p>
-      <w:pPr>
-        <w:spacing w:after="120"/>
-      </w:pPr>
-    </w:p>
-    <w:p>
-      <w:pPr>
-        <w:spacing w:after="200" w:line="288"/>
-      </w:pPr>
-      <w:r>
-        <w:rPr>
-          <w:rFonts w:ascii="Arial" w:cs="Arial" w:eastAsia="Arial" w:hAnsi="Arial"/>
-          <w:sz w:val="22"/>
-          <w:szCs w:val="22"/>
-        </w:rPr>
-        <w:t xml:space="preserve">Единственным (100%) участником ООО «МЕНЕДЖМЕНТ КАПИТАЛ» является ООО «Эм Си Груп» (MC GROUP LLC) (Республика Армения; дата регистрации 05.05.2025, идентификационный номер в Государственном регистре юридических лиц 55422822, ИНН (ՀՎՀՀ) 08298824, юридический адрес: Республика Армения, г. Ереван, район Арабкир, ул. А. Хачатряна, д. 21, кв. 27) – доля 100% (номинальная стоимость 502 449 191 руб.).</w:t>
-      </w:r>
-    </w:p>
-    <w:p>
-      <w:pPr>
-        <w:spacing w:after="200" w:line="288"/>
-      </w:pPr>
-      <w:r>
-        <w:rPr>
-          <w:rFonts w:ascii="Arial" w:cs="Arial" w:eastAsia="Arial" w:hAnsi="Arial"/>
-          <w:sz w:val="22"/>
-          <w:szCs w:val="22"/>
-        </w:rPr>
-        <w:t xml:space="preserve">Единственным (100%) участником ООО «Эм Си Груп» (Армения) является физическое лицо – Геворкян Степан Арамович; руководителем исполнительного органа данной компании является </w:t>
-      </w:r>
-      <w:r>
-        <w:rPr>
-          <w:rFonts w:ascii="Arial" w:cs="Arial" w:eastAsia="Arial" w:hAnsi="Arial"/>
-          <w:sz w:val="22"/>
-          <w:szCs w:val="22"/>
-          <w:highlight w:val="yellow"/>
-          <w:highlightCs w:val="yellow"/>
-        </w:rPr>
-        <w:t xml:space="preserve">[ФИО]</w:t>
-      </w:r>
-      <w:r>
-        <w:rPr>
-          <w:rFonts w:ascii="Arial" w:cs="Arial" w:eastAsia="Arial" w:hAnsi="Arial"/>
-          <w:sz w:val="22"/>
-          <w:szCs w:val="22"/>
-        </w:rPr>
-        <w:t xml:space="preserve">. Геворкян С.А. также является генеральным директором ООО «МЕНЕДЖМЕНТ КАПИТАЛ» (с 5 ноября 2025 года).</w:t>
-      </w:r>
-    </w:p>
-    <w:p>
-      <w:pPr>
-        <w:spacing w:after="200" w:line="288"/>
-      </w:pPr>
-      <w:r>
-        <w:rPr>
-          <w:rFonts w:ascii="Arial" w:cs="Arial" w:eastAsia="Arial" w:hAnsi="Arial"/>
-          <w:sz w:val="22"/>
-          <w:szCs w:val="22"/>
-        </w:rPr>
-        <w:t xml:space="preserve">Таким образом, Геворкян Степан Арамович контролирует 100% уставного капитала ООО «ИДТ» косвенно – через принадлежащее ему на 100% ООО «Эм Си Груп» (Республика Армения), которому, в свою очередь, на 100% принадлежит ООО «МЕНЕДЖМЕНТ КАПИТАЛ», являющееся единственным участником ООО «ИДТ».</w:t>
-      </w:r>
-    </w:p>
-    <w:p>
-      <w:pPr>
-        <w:spacing w:after="80" w:line="288"/>
-      </w:pPr>
-      <w:r>
-        <w:rPr>
-          <w:rFonts w:ascii="Arial" w:cs="Arial" w:eastAsia="Arial" w:hAnsi="Arial"/>
-          <w:sz w:val="22"/>
-          <w:szCs w:val="22"/>
-        </w:rPr>
-        <w:t xml:space="preserve">Гражданство (страновая принадлежность) владельцев:</w:t>
+        <w:t xml:space="preserve">промежуточные звенья цепочки: ООО «МЕНЕДЖМЕНТ КАПИТАЛ» – юридическое лицо Российской Федерации; ООО «Эм Си Груп» – юридическое лицо Республики Армения;</w:t>
       </w:r>
     </w:p>
     <w:p>
@@ -142,7 +119,7 @@
         <w:pStyle w:val="ListParagraph"/>
         <w:numPr>
           <w:ilvl w:val="0"/>
-          <w:numId w:val="3"/>
+          <w:numId w:val="2"/>
         </w:numPr>
         <w:spacing w:after="80" w:line="288"/>
       </w:pPr>
@@ -152,24 +129,6 @@
           <w:sz w:val="22"/>
           <w:szCs w:val="22"/>
         </w:rPr>
-        <w:t xml:space="preserve">промежуточные звенья цепочки: ООО «МЕНЕДЖМЕНТ КАПИТАЛ» – юридическое лицо Российской Федерации; ООО «Эм Си Груп» – юридическое лицо Республики Армения;</w:t>
-      </w:r>
-    </w:p>
-    <w:p>
-      <w:pPr>
-        <w:pStyle w:val="ListParagraph"/>
-        <w:numPr>
-          <w:ilvl w:val="0"/>
-          <w:numId w:val="3"/>
-        </w:numPr>
-        <w:spacing w:after="80" w:line="288"/>
-      </w:pPr>
-      <w:r>
-        <w:rPr>
-          <w:rFonts w:ascii="Arial" w:cs="Arial" w:eastAsia="Arial" w:hAnsi="Arial"/>
-          <w:sz w:val="22"/>
-          <w:szCs w:val="22"/>
-        </w:rPr>
         <w:t xml:space="preserve">конечным владельцем и контролирующим лицом всей цепочки является физическое лицо – Геворкян Степан Арамович, гражданин </w:t>
       </w:r>
       <w:r>
@@ -224,7 +183,7 @@
           <w:sz w:val="22"/>
           <w:szCs w:val="22"/>
         </w:rPr>
-        <w:t xml:space="preserve">В выписке из Государственного регистра юридических лиц Республики Армения участник ООО «Эм Си Груп» указан как «Степан Геворкян» (</w:t>
+        <w:t xml:space="preserve">Таким образом, ООО «ИДТ» полностью соответствует критерию получения государственной аккредитации организации, осуществляющей деятельность в области информационных технологий, </w:t>
       </w:r>
       <w:r>
         <w:rPr>
@@ -234,33 +193,33 @@
           <w:highlight w:val="yellow"/>
           <w:highlightCs w:val="yellow"/>
         </w:rPr>
-        <w:t xml:space="preserve">[документ, удостоверяющий личность, указанный в выписке]</w:t>
-      </w:r>
-      <w:r>
-        <w:rPr>
-          <w:rFonts w:ascii="Arial" w:cs="Arial" w:eastAsia="Arial" w:hAnsi="Arial"/>
-          <w:sz w:val="22"/>
-          <w:szCs w:val="22"/>
-        </w:rPr>
-        <w:t xml:space="preserve">). Указанный в армянской выписке участник и генеральный директор ООО «МЕНЕДЖМЕНТ КАПИТАЛ» Геворкян Степан Арамович (ИНН 770707179846) – одно и то же физическое лицо.</w:t>
-      </w:r>
-    </w:p>
-    <w:p>
-      <w:pPr>
-        <w:spacing w:after="120"/>
-      </w:pPr>
-    </w:p>
-    <w:p>
-      <w:pPr>
-        <w:spacing w:after="200" w:line="288"/>
-      </w:pPr>
-      <w:r>
-        <w:rPr>
-          <w:rFonts w:ascii="Arial" w:cs="Arial" w:eastAsia="Arial" w:hAnsi="Arial"/>
-          <w:sz w:val="22"/>
-          <w:szCs w:val="22"/>
-        </w:rPr>
-        <w:t xml:space="preserve">Единоличным исполнительным органом ООО «ИДТ» является генеральный директор Горянский Эдуард Михайлович (ИНН 773270560877), осуществляющий полномочия с 13 мая 2026 года.</w:t>
+        <w:t xml:space="preserve">[формулировка критерия и ссылка на пункт Положения, утв. постановлением Правительства РФ от 30.09.2022 № 1729]</w:t>
+      </w:r>
+      <w:r>
+        <w:rPr>
+          <w:rFonts w:ascii="Arial" w:cs="Arial" w:eastAsia="Arial" w:hAnsi="Arial"/>
+          <w:sz w:val="22"/>
+          <w:szCs w:val="22"/>
+        </w:rPr>
+        <w:t xml:space="preserve">, поскольку конечным владельцем и контролирующим лицом ООО «ИДТ» является гражданин </w:t>
+      </w:r>
+      <w:r>
+        <w:rPr>
+          <w:rFonts w:ascii="Arial" w:cs="Arial" w:eastAsia="Arial" w:hAnsi="Arial"/>
+          <w:sz w:val="22"/>
+          <w:szCs w:val="22"/>
+          <w:highlight w:val="yellow"/>
+          <w:highlightCs w:val="yellow"/>
+        </w:rPr>
+        <w:t xml:space="preserve">[___]</w:t>
+      </w:r>
+      <w:r>
+        <w:rPr>
+          <w:rFonts w:ascii="Arial" w:cs="Arial" w:eastAsia="Arial" w:hAnsi="Arial"/>
+          <w:sz w:val="22"/>
+          <w:szCs w:val="22"/>
+        </w:rPr>
+        <w:t xml:space="preserve"> Геворкян Степан Арамович.</w:t>
       </w:r>
     </w:p>
     <w:sectPr>
@@ -468,12 +427,6 @@
     </w:lvlOverride>
   </w:num>
   <w:num w:numId="2">
-    <w:abstractNumId w:val="2"/>
-    <w:lvlOverride w:ilvl="0">
-      <w:startOverride w:val="1"/>
-    </w:lvlOverride>
-  </w:num>
-  <w:num w:numId="3">
     <w:abstractNumId w:val="3"/>
     <w:lvlOverride w:ilvl="0">
       <w:startOverride w:val="1"/>

</xml_diff>

<commit_message>
Add IT accreditation ownership criterion to conclusion
Co-Authored-By: Claude Opus 5.5 <noreply@anthropic.com>
Claude-Session: https://claude.ai/code/session_013tCH7y2U4FTDBfDwDzDjyt
</commit_message>
<xml_diff>
--- a/docs/Описание_цепочки_косвенного_участия_ООО_ИДТ.docx
+++ b/docs/Описание_цепочки_косвенного_участия_ООО_ИДТ.docx
@@ -183,7 +183,7 @@
           <w:sz w:val="22"/>
           <w:szCs w:val="22"/>
         </w:rPr>
-        <w:t xml:space="preserve">Таким образом, ООО «ИДТ» полностью соответствует критерию получения государственной аккредитации организации, осуществляющей деятельность в области информационных технологий, </w:t>
+        <w:t xml:space="preserve">Таким образом, ООО «ИДТ» полностью соответствует требованию Положения о государственной аккредитации российских организаций, осуществляющих деятельность в области информационных технологий (утв. постановлением Правительства РФ от 30.09.2022 № 1729, в ред. постановления Правительства РФ от 28.11.2025 № 1949), о прямом и (или) косвенном владении российскими гражданами и (или) российскими юридическими лицами более чем 50% долей в уставном капитале организации, поскольку 100% долей в уставном капитале ООО «ИДТ» косвенно принадлежат </w:t>
       </w:r>
       <w:r>
         <w:rPr>
@@ -193,33 +193,15 @@
           <w:highlight w:val="yellow"/>
           <w:highlightCs w:val="yellow"/>
         </w:rPr>
-        <w:t xml:space="preserve">[формулировка критерия и ссылка на пункт Положения, утв. постановлением Правительства РФ от 30.09.2022 № 1729]</w:t>
-      </w:r>
-      <w:r>
-        <w:rPr>
-          <w:rFonts w:ascii="Arial" w:cs="Arial" w:eastAsia="Arial" w:hAnsi="Arial"/>
-          <w:sz w:val="22"/>
-          <w:szCs w:val="22"/>
-        </w:rPr>
-        <w:t xml:space="preserve">, поскольку конечным владельцем и контролирующим лицом ООО «ИДТ» является гражданин </w:t>
-      </w:r>
-      <w:r>
-        <w:rPr>
-          <w:rFonts w:ascii="Arial" w:cs="Arial" w:eastAsia="Arial" w:hAnsi="Arial"/>
-          <w:sz w:val="22"/>
-          <w:szCs w:val="22"/>
-          <w:highlight w:val="yellow"/>
-          <w:highlightCs w:val="yellow"/>
-        </w:rPr>
-        <w:t xml:space="preserve">[___]</w:t>
-      </w:r>
-      <w:r>
-        <w:rPr>
-          <w:rFonts w:ascii="Arial" w:cs="Arial" w:eastAsia="Arial" w:hAnsi="Arial"/>
-          <w:sz w:val="22"/>
-          <w:szCs w:val="22"/>
-        </w:rPr>
-        <w:t xml:space="preserve"> Геворкян Степан Арамович.</w:t>
+        <w:t xml:space="preserve">[гражданину Российской Федерации]</w:t>
+      </w:r>
+      <w:r>
+        <w:rPr>
+          <w:rFonts w:ascii="Arial" w:cs="Arial" w:eastAsia="Arial" w:hAnsi="Arial"/>
+          <w:sz w:val="22"/>
+          <w:szCs w:val="22"/>
+        </w:rPr>
+        <w:t xml:space="preserve"> Геворкяну Степану Арамовичу.</w:t>
       </w:r>
     </w:p>
     <w:sectPr>

</xml_diff>